<commit_message>
auto(daily): dev loop report 2026-06-24
</commit_message>
<xml_diff>
--- a/reports/hypothesis/2026-06-24.docx
+++ b/reports/hypothesis/2026-06-24.docx
@@ -15,7 +15,7 @@
         <w:rPr>
           <w:i/>
         </w:rPr>
-        <w:t>생성일: 2026-06-24 09:15 KST  |  표본: 측정소당 최소 2724건 / 총 13795건</w:t>
+        <w:t>생성일: 2026-06-24 13:33 KST  |  표본: 측정소당 최소 2729건 / 총 13820건</w:t>
       </w:r>
     </w:p>
     <w:p>
@@ -143,7 +143,7 @@
           </w:tcPr>
           <w:p>
             <w:r>
-              <w:t>35.113</w:t>
+              <w:t>35.063</w:t>
             </w:r>
           </w:p>
         </w:tc>
@@ -153,7 +153,7 @@
           </w:tcPr>
           <w:p>
             <w:r>
-              <w:t>32.281</w:t>
+              <w:t>32.233</w:t>
             </w:r>
           </w:p>
         </w:tc>
@@ -163,7 +163,7 @@
           </w:tcPr>
           <w:p>
             <w:r>
-              <w:t>+2.832</w:t>
+              <w:t>+2.830</w:t>
             </w:r>
           </w:p>
         </w:tc>
@@ -215,7 +215,7 @@
           </w:tcPr>
           <w:p>
             <w:r>
-              <w:t>19.805</w:t>
+              <w:t>19.781</w:t>
             </w:r>
           </w:p>
         </w:tc>
@@ -225,7 +225,7 @@
           </w:tcPr>
           <w:p>
             <w:r>
-              <w:t>17.167</w:t>
+              <w:t>17.147</w:t>
             </w:r>
           </w:p>
         </w:tc>
@@ -235,7 +235,7 @@
           </w:tcPr>
           <w:p>
             <w:r>
-              <w:t>+2.638</w:t>
+              <w:t>+2.633</w:t>
             </w:r>
           </w:p>
         </w:tc>
@@ -660,7 +660,7 @@
           </w:tcPr>
           <w:p>
             <w:r>
-              <w:t>30.85</w:t>
+              <w:t>30.81</w:t>
             </w:r>
           </w:p>
         </w:tc>
@@ -722,7 +722,7 @@
           </w:tcPr>
           <w:p>
             <w:r>
-              <w:t>81.99</w:t>
+              <w:t>81.54</w:t>
             </w:r>
           </w:p>
         </w:tc>
@@ -846,7 +846,7 @@
           </w:tcPr>
           <w:p>
             <w:r>
-              <w:t>159.57</w:t>
+              <w:t>159.02</w:t>
             </w:r>
           </w:p>
         </w:tc>
@@ -876,7 +876,7 @@
           </w:tcPr>
           <w:p>
             <w:r>
-              <w:t>0.046</w:t>
+              <w:t>0.045</w:t>
             </w:r>
           </w:p>
         </w:tc>
@@ -908,7 +908,7 @@
           </w:tcPr>
           <w:p>
             <w:r>
-              <w:t>70.49</w:t>
+              <w:t>70.44</w:t>
             </w:r>
           </w:p>
         </w:tc>
@@ -970,7 +970,7 @@
           </w:tcPr>
           <w:p>
             <w:r>
-              <w:t>173.92</w:t>
+              <w:t>173.69</w:t>
             </w:r>
           </w:p>
         </w:tc>
@@ -1000,7 +1000,7 @@
           </w:tcPr>
           <w:p>
             <w:r>
-              <w:t>0.050</w:t>
+              <w:t>0.049</w:t>
             </w:r>
           </w:p>
         </w:tc>
@@ -1029,7 +1029,7 @@
         <w:pStyle w:val="ListBullet"/>
       </w:pPr>
       <w:r>
-        <w:t>'산단 영향군'가 '베이스라인'보다 평균 2.64 높음 (p=0.0000, 효과크기 작음 d=0.20).</w:t>
+        <w:t>'산단 영향군'가 '베이스라인'보다 평균 2.63 높음 (p=0.0000, 효과크기 작음 d=0.20).</w:t>
       </w:r>
     </w:p>
     <w:p>

</xml_diff>